<commit_message>
Update PNAS manuscript with stochastic RP figures after Stage 13.
Co-authored-by: Cursor <cursoragent@cursor.com>
</commit_message>
<xml_diff>
--- a/docs/pnas_article_review.docx
+++ b/docs/pnas_article_review.docx
@@ -27,7 +27,7 @@
           <w:bCs/>
           <w:sz w:val="24"/>
         </w:rPr>
-        <w:t xml:space="preserve">DRAFT FOR REVIEW — 2026-07-08</w:t>
+        <w:t xml:space="preserve">DRAFT FOR REVIEW — 2026-07-09</w:t>
       </w:r>
       <w:r>
         <w:rPr>
@@ -87,7 +87,7 @@
         </w:pict>
       </w:r>
     </w:p>
-    <w:bookmarkStart w:id="68" w:name="Xd4fd91941f0ded5045cb5d86e17e40ac2aa7837"/>
+    <w:bookmarkStart w:id="74" w:name="Xd4fd91941f0ded5045cb5d86e17e40ac2aa7837"/>
     <w:p>
       <w:pPr>
         <w:pStyle w:val="Heading1"/>
@@ -173,7 +173,7 @@
           <w:rFonts w:ascii="Times New Roman" w:hAnsi="Times New Roman"/>
           <w:sz w:val="24"/>
         </w:rPr>
-        <w:t xml:space="preserve">2026-07-08 22:48:13</w:t>
+        <w:t xml:space="preserve">2026-07-09 11:47:13</w:t>
       </w:r>
       <w:r>
         <w:rPr>
@@ -2185,67 +2185,9 @@
         </w:pict>
       </w:r>
     </w:p>
-    <w:p>
-      <w:pPr>
-        <w:pStyle w:val="BlockText"/>
-        <w:spacing w:line="480" w:lineRule="auto" w:after="0" w:before="0"/>
-      </w:pPr>
-      <w:r>
-        <w:rPr>
-          <w:rFonts w:ascii="Times New Roman" w:hAnsi="Times New Roman"/>
-          <w:b/>
-          <w:bCs/>
-          <w:sz w:val="24"/>
-        </w:rPr>
-        <w:t xml:space="preserve">Note:</w:t>
-      </w:r>
-      <w:r>
-        <w:rPr>
-          <w:rFonts w:ascii="Times New Roman" w:hAnsi="Times New Roman"/>
-          <w:sz w:val="24"/>
-        </w:rPr>
-        <w:t xml:space="preserve"> </w:t>
-      </w:r>
-      <w:r>
-        <w:rPr>
-          <w:rFonts w:ascii="Times New Roman" w:hAnsi="Times New Roman"/>
-          <w:sz w:val="24"/>
-        </w:rPr>
-        <w:t xml:space="preserve">Figures pending Stage 13/14 outputs: fig12_rp_100yr_stochastic.png, fig13_analytical_vs_stochastic.png. Re-run</w:t>
-      </w:r>
-      <w:r>
-        <w:rPr>
-          <w:rFonts w:ascii="Times New Roman" w:hAnsi="Times New Roman"/>
-          <w:sz w:val="24"/>
-        </w:rPr>
-        <w:t xml:space="preserve"> </w:t>
-      </w:r>
-      <w:r>
-        <w:rPr>
-          <w:rStyle w:val="VerbatimChar"/>
-          <w:rFonts w:ascii="Times New Roman" w:hAnsi="Times New Roman"/>
-          <w:sz w:val="24"/>
-        </w:rPr>
-        <w:t xml:space="preserve">render_pnas_article_figures.py</w:t>
-      </w:r>
-      <w:r>
-        <w:rPr>
-          <w:rFonts w:ascii="Times New Roman" w:hAnsi="Times New Roman"/>
-          <w:sz w:val="24"/>
-        </w:rPr>
-        <w:t xml:space="preserve"> </w:t>
-      </w:r>
-      <w:r>
-        <w:rPr>
-          <w:rFonts w:ascii="Times New Roman" w:hAnsi="Times New Roman"/>
-          <w:sz w:val="24"/>
-        </w:rPr>
-        <w:t xml:space="preserve">after the stochastic catalog completes.</w:t>
-      </w:r>
-    </w:p>
     <w:bookmarkEnd w:id="20"/>
     <w:bookmarkEnd w:id="21"/>
-    <w:bookmarkStart w:id="58" w:name="figures"/>
+    <w:bookmarkStart w:id="64" w:name="figures"/>
     <w:p>
       <w:pPr>
         <w:pStyle w:val="Heading2"/>
@@ -3052,7 +2994,7 @@
         </w:rPr>
         <w:drawing>
           <wp:inline>
-            <wp:extent cx="5334000" cy="2680057"/>
+            <wp:extent cx="5334000" cy="2689934"/>
             <wp:effectExtent b="0" l="0" r="0" t="0"/>
             <wp:docPr descr="Figure 8" title="" id="47" name="Picture"/>
             <a:graphic>
@@ -3073,7 +3015,7 @@
                   <pic:spPr bwMode="auto">
                     <a:xfrm>
                       <a:off x="0" y="0"/>
-                      <a:ext cx="5334000" cy="2680057"/>
+                      <a:ext cx="5334000" cy="2689934"/>
                     </a:xfrm>
                     <a:prstGeom prst="rect">
                       <a:avLst/>
@@ -3146,7 +3088,7 @@
         </w:rPr>
         <w:drawing>
           <wp:inline>
-            <wp:extent cx="5334000" cy="2711587"/>
+            <wp:extent cx="5334000" cy="2689934"/>
             <wp:effectExtent b="0" l="0" r="0" t="0"/>
             <wp:docPr descr="Figure 9" title="" id="50" name="Picture"/>
             <a:graphic>
@@ -3167,7 +3109,7 @@
                   <pic:spPr bwMode="auto">
                     <a:xfrm>
                       <a:off x="0" y="0"/>
-                      <a:ext cx="5334000" cy="2711587"/>
+                      <a:ext cx="5334000" cy="2689934"/>
                     </a:xfrm>
                     <a:prstGeom prst="rect">
                       <a:avLst/>
@@ -3399,53 +3341,86 @@
           <w:bCs/>
           <w:sz w:val="24"/>
         </w:rPr>
+        <w:t xml:space="preserve">Figure 12.</w:t>
+      </w:r>
+      <w:r>
+        <w:rPr>
+          <w:rFonts w:ascii="Times New Roman" w:hAnsi="Times New Roman"/>
+          <w:sz w:val="24"/>
+        </w:rPr>
+        <w:t xml:space="preserve"> </w:t>
+      </w:r>
+      <w:r>
+        <w:rPr>
+          <w:rFonts w:ascii="Times New Roman" w:hAnsi="Times New Roman"/>
+          <w:sz w:val="24"/>
+        </w:rPr>
+        <w:t xml:space="preserve">Stochastic 100-year empirical return-period map (50,000-yr catalog; Lambert Conformal).</w:t>
+      </w:r>
+    </w:p>
+    <w:p>
+      <w:pPr>
+        <w:pStyle w:val="CaptionedFigure"/>
+        <w:spacing w:line="480" w:lineRule="auto" w:after="0" w:before="0"/>
+      </w:pPr>
+      <w:r>
+        <w:rPr>
+          <w:rFonts w:ascii="Times New Roman" w:hAnsi="Times New Roman"/>
+          <w:sz w:val="24"/>
+        </w:rPr>
+        <w:drawing>
+          <wp:inline>
+            <wp:extent cx="5334000" cy="2689934"/>
+            <wp:effectExtent b="0" l="0" r="0" t="0"/>
+            <wp:docPr descr="Figure 12" title="" id="59" name="Picture"/>
+            <a:graphic>
+              <a:graphicData uri="http://schemas.openxmlformats.org/drawingml/2006/picture">
+                <pic:pic>
+                  <pic:nvPicPr>
+                    <pic:cNvPr descr="figures/pnas/fig12_rp_100yr_stochastic.png" id="60" name="Picture"/>
+                    <pic:cNvPicPr>
+                      <a:picLocks noChangeArrowheads="1" noChangeAspect="1"/>
+                    </pic:cNvPicPr>
+                  </pic:nvPicPr>
+                  <pic:blipFill>
+                    <a:blip r:embed="rId58"/>
+                    <a:stretch>
+                      <a:fillRect/>
+                    </a:stretch>
+                  </pic:blipFill>
+                  <pic:spPr bwMode="auto">
+                    <a:xfrm>
+                      <a:off x="0" y="0"/>
+                      <a:ext cx="5334000" cy="2689934"/>
+                    </a:xfrm>
+                    <a:prstGeom prst="rect">
+                      <a:avLst/>
+                    </a:prstGeom>
+                    <a:noFill/>
+                    <a:ln w="9525">
+                      <a:noFill/>
+                      <a:headEnd/>
+                      <a:tailEnd/>
+                    </a:ln>
+                  </pic:spPr>
+                </pic:pic>
+              </a:graphicData>
+            </a:graphic>
+          </wp:inline>
+        </w:drawing>
+      </w:r>
+    </w:p>
+    <w:p>
+      <w:pPr>
+        <w:pStyle w:val="ImageCaption"/>
+        <w:spacing w:line="480" w:lineRule="auto" w:after="0" w:before="0"/>
+      </w:pPr>
+      <w:r>
+        <w:rPr>
+          <w:rFonts w:ascii="Times New Roman" w:hAnsi="Times New Roman"/>
+          <w:sz w:val="24"/>
+        </w:rPr>
         <w:t xml:space="preserve">Figure 12</w:t>
-      </w:r>
-      <w:r>
-        <w:rPr>
-          <w:rFonts w:ascii="Times New Roman" w:hAnsi="Times New Roman"/>
-          <w:sz w:val="24"/>
-        </w:rPr>
-        <w:t xml:space="preserve"> </w:t>
-      </w:r>
-      <w:r>
-        <w:rPr>
-          <w:rFonts w:ascii="Times New Roman" w:hAnsi="Times New Roman"/>
-          <w:sz w:val="24"/>
-        </w:rPr>
-        <w:t xml:space="preserve">—</w:t>
-      </w:r>
-      <w:r>
-        <w:rPr>
-          <w:rFonts w:ascii="Times New Roman" w:hAnsi="Times New Roman"/>
-          <w:sz w:val="24"/>
-        </w:rPr>
-        <w:t xml:space="preserve"> </w:t>
-      </w:r>
-      <w:r>
-        <w:rPr>
-          <w:rFonts w:ascii="Times New Roman" w:hAnsi="Times New Roman"/>
-          <w:i/>
-          <w:iCs/>
-          <w:sz w:val="24"/>
-        </w:rPr>
-        <w:t xml:space="preserve">Stochastic 100-year empirical return-period map (50,000-yr catalog; Lambert Conformal).</w:t>
-      </w:r>
-      <w:r>
-        <w:rPr>
-          <w:rFonts w:ascii="Times New Roman" w:hAnsi="Times New Roman"/>
-          <w:sz w:val="24"/>
-        </w:rPr>
-        <w:t xml:space="preserve"> </w:t>
-      </w:r>
-      <w:r>
-        <w:rPr>
-          <w:rFonts w:ascii="Times New Roman" w:hAnsi="Times New Roman"/>
-          <w:i/>
-          <w:iCs/>
-          <w:sz w:val="24"/>
-        </w:rPr>
-        <w:t xml:space="preserve">(figure pending)</w:t>
       </w:r>
     </w:p>
     <w:p>
@@ -3460,53 +3435,86 @@
           <w:bCs/>
           <w:sz w:val="24"/>
         </w:rPr>
+        <w:t xml:space="preserve">Figure 13.</w:t>
+      </w:r>
+      <w:r>
+        <w:rPr>
+          <w:rFonts w:ascii="Times New Roman" w:hAnsi="Times New Roman"/>
+          <w:sz w:val="24"/>
+        </w:rPr>
+        <w:t xml:space="preserve"> </w:t>
+      </w:r>
+      <w:r>
+        <w:rPr>
+          <w:rFonts w:ascii="Times New Roman" w:hAnsi="Times New Roman"/>
+          <w:sz w:val="24"/>
+        </w:rPr>
+        <w:t xml:space="preserve">Analytical vs stochastic 100-year return-period comparison (Lambert Conformal).</w:t>
+      </w:r>
+    </w:p>
+    <w:p>
+      <w:pPr>
+        <w:pStyle w:val="CaptionedFigure"/>
+        <w:spacing w:line="480" w:lineRule="auto" w:after="0" w:before="0"/>
+      </w:pPr>
+      <w:r>
+        <w:rPr>
+          <w:rFonts w:ascii="Times New Roman" w:hAnsi="Times New Roman"/>
+          <w:sz w:val="24"/>
+        </w:rPr>
+        <w:drawing>
+          <wp:inline>
+            <wp:extent cx="5334000" cy="1918705"/>
+            <wp:effectExtent b="0" l="0" r="0" t="0"/>
+            <wp:docPr descr="Figure 13" title="" id="62" name="Picture"/>
+            <a:graphic>
+              <a:graphicData uri="http://schemas.openxmlformats.org/drawingml/2006/picture">
+                <pic:pic>
+                  <pic:nvPicPr>
+                    <pic:cNvPr descr="figures/pnas/fig13_analytical_vs_stochastic.png" id="63" name="Picture"/>
+                    <pic:cNvPicPr>
+                      <a:picLocks noChangeArrowheads="1" noChangeAspect="1"/>
+                    </pic:cNvPicPr>
+                  </pic:nvPicPr>
+                  <pic:blipFill>
+                    <a:blip r:embed="rId61"/>
+                    <a:stretch>
+                      <a:fillRect/>
+                    </a:stretch>
+                  </pic:blipFill>
+                  <pic:spPr bwMode="auto">
+                    <a:xfrm>
+                      <a:off x="0" y="0"/>
+                      <a:ext cx="5334000" cy="1918705"/>
+                    </a:xfrm>
+                    <a:prstGeom prst="rect">
+                      <a:avLst/>
+                    </a:prstGeom>
+                    <a:noFill/>
+                    <a:ln w="9525">
+                      <a:noFill/>
+                      <a:headEnd/>
+                      <a:tailEnd/>
+                    </a:ln>
+                  </pic:spPr>
+                </pic:pic>
+              </a:graphicData>
+            </a:graphic>
+          </wp:inline>
+        </w:drawing>
+      </w:r>
+    </w:p>
+    <w:p>
+      <w:pPr>
+        <w:pStyle w:val="ImageCaption"/>
+        <w:spacing w:line="480" w:lineRule="auto" w:after="0" w:before="0"/>
+      </w:pPr>
+      <w:r>
+        <w:rPr>
+          <w:rFonts w:ascii="Times New Roman" w:hAnsi="Times New Roman"/>
+          <w:sz w:val="24"/>
+        </w:rPr>
         <w:t xml:space="preserve">Figure 13</w:t>
-      </w:r>
-      <w:r>
-        <w:rPr>
-          <w:rFonts w:ascii="Times New Roman" w:hAnsi="Times New Roman"/>
-          <w:sz w:val="24"/>
-        </w:rPr>
-        <w:t xml:space="preserve"> </w:t>
-      </w:r>
-      <w:r>
-        <w:rPr>
-          <w:rFonts w:ascii="Times New Roman" w:hAnsi="Times New Roman"/>
-          <w:sz w:val="24"/>
-        </w:rPr>
-        <w:t xml:space="preserve">—</w:t>
-      </w:r>
-      <w:r>
-        <w:rPr>
-          <w:rFonts w:ascii="Times New Roman" w:hAnsi="Times New Roman"/>
-          <w:sz w:val="24"/>
-        </w:rPr>
-        <w:t xml:space="preserve"> </w:t>
-      </w:r>
-      <w:r>
-        <w:rPr>
-          <w:rFonts w:ascii="Times New Roman" w:hAnsi="Times New Roman"/>
-          <w:i/>
-          <w:iCs/>
-          <w:sz w:val="24"/>
-        </w:rPr>
-        <w:t xml:space="preserve">Analytical vs stochastic 100-year return-period comparison (Lambert Conformal).</w:t>
-      </w:r>
-      <w:r>
-        <w:rPr>
-          <w:rFonts w:ascii="Times New Roman" w:hAnsi="Times New Roman"/>
-          <w:sz w:val="24"/>
-        </w:rPr>
-        <w:t xml:space="preserve"> </w:t>
-      </w:r>
-      <w:r>
-        <w:rPr>
-          <w:rFonts w:ascii="Times New Roman" w:hAnsi="Times New Roman"/>
-          <w:i/>
-          <w:iCs/>
-          <w:sz w:val="24"/>
-        </w:rPr>
-        <w:t xml:space="preserve">(figure pending)</w:t>
       </w:r>
     </w:p>
     <w:p>
@@ -3523,8 +3531,8 @@
         </w:pict>
       </w:r>
     </w:p>
-    <w:bookmarkEnd w:id="58"/>
-    <w:bookmarkStart w:id="59" w:name="discussion"/>
+    <w:bookmarkEnd w:id="64"/>
+    <w:bookmarkStart w:id="65" w:name="discussion"/>
     <w:p>
       <w:pPr>
         <w:pStyle w:val="Heading2"/>
@@ -3806,8 +3814,8 @@
         </w:pict>
       </w:r>
     </w:p>
-    <w:bookmarkEnd w:id="59"/>
-    <w:bookmarkStart w:id="60" w:name="limitations"/>
+    <w:bookmarkEnd w:id="65"/>
+    <w:bookmarkStart w:id="66" w:name="limitations"/>
     <w:p>
       <w:pPr>
         <w:pStyle w:val="Heading2"/>
@@ -3964,8 +3972,8 @@
         </w:pict>
       </w:r>
     </w:p>
-    <w:bookmarkEnd w:id="60"/>
-    <w:bookmarkStart w:id="66" w:name="materials-and-methods"/>
+    <w:bookmarkEnd w:id="66"/>
+    <w:bookmarkStart w:id="72" w:name="materials-and-methods"/>
     <w:p>
       <w:pPr>
         <w:pStyle w:val="Heading2"/>
@@ -3979,7 +3987,7 @@
         <w:t xml:space="preserve">Materials and Methods</w:t>
       </w:r>
     </w:p>
-    <w:bookmarkStart w:id="61" w:name="computational-environment"/>
+    <w:bookmarkStart w:id="67" w:name="computational-environment"/>
     <w:p>
       <w:pPr>
         <w:pStyle w:val="Heading3"/>
@@ -4146,8 +4154,8 @@
         <w:t xml:space="preserve"> scripts/14_render_figures.py</w:t>
       </w:r>
     </w:p>
-    <w:bookmarkEnd w:id="61"/>
-    <w:bookmarkStart w:id="62" w:name="pipeline-stages"/>
+    <w:bookmarkEnd w:id="67"/>
+    <w:bookmarkStart w:id="68" w:name="pipeline-stages"/>
     <w:p>
       <w:pPr>
         <w:pStyle w:val="Heading3"/>
@@ -4516,8 +4524,8 @@
         <w:t xml:space="preserve">L3  Financial loss — policy terms and roll-ups</w:t>
       </w:r>
     </w:p>
-    <w:bookmarkEnd w:id="62"/>
-    <w:bookmarkStart w:id="63" w:name="ai-disclosure"/>
+    <w:bookmarkEnd w:id="68"/>
+    <w:bookmarkStart w:id="69" w:name="ai-disclosure"/>
     <w:p>
       <w:pPr>
         <w:pStyle w:val="Heading3"/>
@@ -4631,8 +4639,8 @@
         <w:t xml:space="preserve">(OpenAI, accessed May 2026). AI assistance included literature synthesis, code generation, code review, test authoring, documentation editing, shell-command planning, and long-running pipeline monitoring. Git operations (commit, push, merge) were performed by the human operator. AI outputs were reviewed, edited, tested, and accepted under human direction. AI systems are not listed as authors and are not treated as accountable scientific contributors.</w:t>
       </w:r>
     </w:p>
-    <w:bookmarkEnd w:id="63"/>
-    <w:bookmarkStart w:id="65" w:name="data-and-code-availability"/>
+    <w:bookmarkEnd w:id="69"/>
+    <w:bookmarkStart w:id="71" w:name="data-and-code-availability"/>
     <w:p>
       <w:pPr>
         <w:pStyle w:val="Heading3"/>
@@ -4694,7 +4702,7 @@
         </w:rPr>
         <w:t xml:space="preserve"> </w:t>
       </w:r>
-      <w:hyperlink r:id="rId64">
+      <w:hyperlink r:id="rId70">
         <w:r>
           <w:rPr>
             <w:rStyle w:val="Hyperlink"/>
@@ -5028,9 +5036,9 @@
         </w:pict>
       </w:r>
     </w:p>
-    <w:bookmarkEnd w:id="65"/>
-    <w:bookmarkEnd w:id="66"/>
-    <w:bookmarkStart w:id="67" w:name="references"/>
+    <w:bookmarkEnd w:id="71"/>
+    <w:bookmarkEnd w:id="72"/>
+    <w:bookmarkStart w:id="73" w:name="references"/>
     <w:p>
       <w:pPr>
         <w:pStyle w:val="Heading2"/>
@@ -6171,8 +6179,8 @@
         <w:t xml:space="preserve">, 13, 286–303.</w:t>
       </w:r>
     </w:p>
-    <w:bookmarkEnd w:id="67"/>
-    <w:bookmarkEnd w:id="68"/>
+    <w:bookmarkEnd w:id="73"/>
+    <w:bookmarkEnd w:id="74"/>
     <w:sectPr>
       <w:footnotePr>
         <w:numRestart w:val="eachSect"/>

</xml_diff>